<commit_message>
Projects: real screenshots, remove duplicated Hub card, fix title over preview
- Previews replaced with screenshots captured from the running systems
  (GMAO PROMART, ObraPulse, GMAO Metro de Quito, Lunch Management)
- Audiovisual Hub card removed from Projects: it is already covered in
  Highlights
- The card title no longer sits above the preview. Raising it left dark
  text on the dark preview, so only the red # and arrow were visible
- External-link marker rewritten as ASCII: the CSS escape had been
  mangled into a control character

Co-Authored-By: Claude Opus 5 <noreply@anthropic.com>
</commit_message>
<xml_diff>
--- a/Informe-Workshop2.docx
+++ b/Informe-Workshop2.docx
@@ -965,7 +965,7 @@
       <w:r>
         <w:drawing>
           <wp:inline xmlns:a="http://schemas.openxmlformats.org/drawingml/2006/main" xmlns:pic="http://schemas.openxmlformats.org/drawingml/2006/picture">
-            <wp:extent cx="5486400" cy="4590288"/>
+            <wp:extent cx="5486400" cy="3931920"/>
             <wp:docPr id="4" name="Picture 4"/>
             <wp:cNvGraphicFramePr>
               <a:graphicFrameLocks noChangeAspect="1"/>
@@ -986,7 +986,7 @@
                   <pic:spPr>
                     <a:xfrm>
                       <a:off x="0" y="0"/>
-                      <a:ext cx="5486400" cy="4590288"/>
+                      <a:ext cx="5486400" cy="3931920"/>
                     </a:xfrm>
                     <a:prstGeom prst="rect"/>
                   </pic:spPr>
@@ -1018,7 +1018,7 @@
           <w:color w:val="7A6A6C"/>
           <w:sz w:val="18"/>
         </w:rPr>
-        <w:t>The projects grid. The layout reflows by itself with repeat(auto-fit, minmax(290px, 1fr)) and no media queries.</w:t>
+        <w:t>The projects grid. Each preview is a screenshot of the running system, captured for this report. The layout reflows by itself with repeat(auto-fit, minmax(290px, 1fr)) and no media queries.</w:t>
       </w:r>
     </w:p>
     <w:p>
@@ -1273,7 +1273,7 @@
                 <w:color w:val="191113"/>
                 <w:sz w:val="20"/>
               </w:rPr>
-              <w:t>Seven cards with hover previews and links to the live systems.</w:t>
+              <w:t>Six cards with hover previews. Four titles link to the live system.</w:t>
             </w:r>
           </w:p>
         </w:tc>

</xml_diff>

<commit_message>
UX pass: header, accessibility and a colour per subject
Header rebuilt: logo, title and menu now share one centred container.
They used to sit outside the element carrying the width limit, so their
left edges did not line up and the header took three rows.

Accessibility:
- Skip link as the first focusable element on every page
- aria-current="page" on the active menu item, styled from that
  attribute so markup and CSS share one source of truth
- Menu links at least 44px tall; visible focus rings throughout
- main#main as the skip target

A pastel per subject, repeated across the timetable, the session table
and each course page. Colour reinforces the course code already written
in every cell, so it is never the only cue. Worst-case text contrast on
the pastels is 11.02:1, both themes.

Also: 100dvh for the welcome screens, scroll-margin reduced to match the
shorter header.

Co-Authored-By: Claude Opus 5 <noreply@anthropic.com>
</commit_message>
<xml_diff>
--- a/Informe-Workshop2.docx
+++ b/Informe-Workshop2.docx
@@ -1054,6 +1054,492 @@
     <w:p>
       <w:pPr>
         <w:keepNext/>
+        <w:spacing w:before="280" w:after="100"/>
+      </w:pPr>
+      <w:r>
+        <w:rPr>
+          <w:rFonts w:ascii="Cambria" w:hAnsi="Cambria"/>
+          <w:b/>
+          <w:color w:val="191113"/>
+          <w:sz w:val="24"/>
+        </w:rPr>
+        <w:t>Usability and accessibility</w:t>
+      </w:r>
+    </w:p>
+    <w:p>
+      <w:pPr>
+        <w:spacing w:after="160"/>
+      </w:pPr>
+      <w:r>
+        <w:rPr>
+          <w:rFonts w:ascii="Cambria" w:hAnsi="Cambria"/>
+          <w:b w:val="0"/>
+          <w:i w:val="0"/>
+          <w:color w:val="191113"/>
+          <w:sz w:val="22"/>
+        </w:rPr>
+        <w:t>A review pass was run over the whole site with two goals: that it works for someone who never touches a mouse, and that nothing depends on being able to tell colours apart.</w:t>
+      </w:r>
+    </w:p>
+    <w:p>
+      <w:pPr>
+        <w:pStyle w:val="ListBullet"/>
+        <w:spacing w:after="60"/>
+      </w:pPr>
+      <w:r>
+        <w:rPr>
+          <w:rFonts w:ascii="Cambria" w:hAnsi="Cambria"/>
+          <w:b/>
+          <w:color w:val="191113"/>
+          <w:sz w:val="21"/>
+        </w:rPr>
+        <w:t xml:space="preserve">Skip link. </w:t>
+      </w:r>
+      <w:r>
+        <w:rPr>
+          <w:rFonts w:ascii="Cambria" w:hAnsi="Cambria"/>
+          <w:b w:val="0"/>
+          <w:color w:val="191113"/>
+          <w:sz w:val="21"/>
+        </w:rPr>
+        <w:t>The first focusable element on every page jumps straight to the content, so a keyboard user does not tab through the six menu entries on each page.</w:t>
+      </w:r>
+    </w:p>
+    <w:p>
+      <w:pPr>
+        <w:pStyle w:val="ListBullet"/>
+        <w:spacing w:after="60"/>
+      </w:pPr>
+      <w:r>
+        <w:rPr>
+          <w:rFonts w:ascii="Cambria" w:hAnsi="Cambria"/>
+          <w:b/>
+          <w:color w:val="191113"/>
+          <w:sz w:val="21"/>
+        </w:rPr>
+        <w:t xml:space="preserve">Current page marked. </w:t>
+      </w:r>
+      <w:r>
+        <w:rPr>
+          <w:rFonts w:ascii="Cambria" w:hAnsi="Cambria"/>
+          <w:b w:val="0"/>
+          <w:color w:val="191113"/>
+          <w:sz w:val="21"/>
+        </w:rPr>
+        <w:t xml:space="preserve">The active menu item carries </w:t>
+      </w:r>
+      <w:r>
+        <w:rPr>
+          <w:rFonts w:ascii="Consolas" w:hAnsi="Consolas"/>
+          <w:b w:val="0"/>
+          <w:color w:val="7A6A6C"/>
+          <w:sz w:val="19"/>
+        </w:rPr>
+        <w:t>aria-current="page"</w:t>
+      </w:r>
+      <w:r>
+        <w:rPr>
+          <w:rFonts w:ascii="Cambria" w:hAnsi="Cambria"/>
+          <w:b w:val="0"/>
+          <w:color w:val="191113"/>
+          <w:sz w:val="21"/>
+        </w:rPr>
+        <w:t>, which a screen reader announces and the CSS styles from the same attribute: one source of truth, not two.</w:t>
+      </w:r>
+    </w:p>
+    <w:p>
+      <w:pPr>
+        <w:pStyle w:val="ListBullet"/>
+        <w:spacing w:after="60"/>
+      </w:pPr>
+      <w:r>
+        <w:rPr>
+          <w:rFonts w:ascii="Cambria" w:hAnsi="Cambria"/>
+          <w:b/>
+          <w:color w:val="191113"/>
+          <w:sz w:val="21"/>
+        </w:rPr>
+        <w:t xml:space="preserve">Touch targets. </w:t>
+      </w:r>
+      <w:r>
+        <w:rPr>
+          <w:rFonts w:ascii="Cambria" w:hAnsi="Cambria"/>
+          <w:b w:val="0"/>
+          <w:color w:val="191113"/>
+          <w:sz w:val="21"/>
+        </w:rPr>
+        <w:t>Menu links are at least 44 pixels tall, the smallest comfortable size for a finger.</w:t>
+      </w:r>
+    </w:p>
+    <w:p>
+      <w:pPr>
+        <w:pStyle w:val="ListBullet"/>
+        <w:spacing w:after="60"/>
+      </w:pPr>
+      <w:r>
+        <w:rPr>
+          <w:rFonts w:ascii="Cambria" w:hAnsi="Cambria"/>
+          <w:b/>
+          <w:color w:val="191113"/>
+          <w:sz w:val="21"/>
+        </w:rPr>
+        <w:t xml:space="preserve">Visible focus. </w:t>
+      </w:r>
+      <w:r>
+        <w:rPr>
+          <w:rFonts w:ascii="Cambria" w:hAnsi="Cambria"/>
+          <w:b w:val="0"/>
+          <w:color w:val="191113"/>
+          <w:sz w:val="21"/>
+        </w:rPr>
+        <w:t>Every interactive element shows a focus ring; none of them removes the outline without replacing it.</w:t>
+      </w:r>
+    </w:p>
+    <w:p>
+      <w:pPr>
+        <w:pStyle w:val="ListBullet"/>
+        <w:spacing w:after="60"/>
+      </w:pPr>
+      <w:r>
+        <w:rPr>
+          <w:rFonts w:ascii="Cambria" w:hAnsi="Cambria"/>
+          <w:b/>
+          <w:color w:val="191113"/>
+          <w:sz w:val="21"/>
+        </w:rPr>
+        <w:t xml:space="preserve">The header was rebuilt. </w:t>
+      </w:r>
+      <w:r>
+        <w:rPr>
+          <w:rFonts w:ascii="Cambria" w:hAnsi="Cambria"/>
+          <w:b w:val="0"/>
+          <w:color w:val="191113"/>
+          <w:sz w:val="21"/>
+        </w:rPr>
+        <w:t>Logo, title and menu now share one centred container. Before, the logo and title sat outside the element that carried the width limit, so their left edges did not line up and the header took three rows.</w:t>
+      </w:r>
+    </w:p>
+    <w:p>
+      <w:pPr>
+        <w:keepNext/>
+        <w:spacing w:before="280" w:after="100"/>
+      </w:pPr>
+      <w:r>
+        <w:rPr>
+          <w:rFonts w:ascii="Cambria" w:hAnsi="Cambria"/>
+          <w:b/>
+          <w:color w:val="191113"/>
+          <w:sz w:val="24"/>
+        </w:rPr>
+        <w:t>A colour per subject</w:t>
+      </w:r>
+    </w:p>
+    <w:p>
+      <w:pPr>
+        <w:spacing w:after="160"/>
+      </w:pPr>
+      <w:r>
+        <w:rPr>
+          <w:rFonts w:ascii="Cambria" w:hAnsi="Cambria"/>
+          <w:b w:val="0"/>
+          <w:i w:val="0"/>
+          <w:color w:val="191113"/>
+          <w:sz w:val="22"/>
+        </w:rPr>
+        <w:t>Each course has its own pastel, and it repeats across the timetable, the session table and the course page, so the eye can follow one subject from one page to another.</w:t>
+      </w:r>
+    </w:p>
+    <w:tbl>
+      <w:tblPr>
+        <w:tblW w:type="auto" w:w="0"/>
+        <w:tblLook w:firstColumn="1" w:firstRow="1" w:lastColumn="0" w:lastRow="0" w:noHBand="0" w:noVBand="1" w:val="04A0"/>
+        <w:tblBorders>
+          <w:top w:val="single" w:sz="4" w:space="0" w:color="DED2D2"/>
+          <w:left w:val="single" w:sz="4" w:space="0" w:color="DED2D2"/>
+          <w:bottom w:val="single" w:sz="4" w:space="0" w:color="DED2D2"/>
+          <w:right w:val="single" w:sz="4" w:space="0" w:color="DED2D2"/>
+          <w:insideH w:val="single" w:sz="4" w:space="0" w:color="DED2D2"/>
+          <w:insideV w:val="single" w:sz="4" w:space="0" w:color="DED2D2"/>
+        </w:tblBorders>
+      </w:tblPr>
+      <w:tblGrid>
+        <w:gridCol w:w="3120"/>
+        <w:gridCol w:w="3120"/>
+        <w:gridCol w:w="3120"/>
+      </w:tblGrid>
+      <w:tr>
+        <w:tc>
+          <w:tcPr>
+            <w:tcW w:type="dxa" w:w="3744"/>
+            <w:shd w:val="clear" w:color="auto" w:fill="F7F1F1"/>
+          </w:tcPr>
+          <w:p>
+            <w:pPr>
+              <w:spacing w:after="40"/>
+            </w:pPr>
+            <w:r>
+              <w:rPr>
+                <w:rFonts w:ascii="Cambria" w:hAnsi="Cambria"/>
+                <w:b/>
+                <w:color w:val="9E1119"/>
+                <w:sz w:val="20"/>
+              </w:rPr>
+              <w:t>Course</w:t>
+            </w:r>
+          </w:p>
+        </w:tc>
+        <w:tc>
+          <w:tcPr>
+            <w:tcW w:type="dxa" w:w="2016"/>
+            <w:shd w:val="clear" w:color="auto" w:fill="F7F1F1"/>
+          </w:tcPr>
+          <w:p>
+            <w:pPr>
+              <w:spacing w:after="40"/>
+            </w:pPr>
+            <w:r>
+              <w:rPr>
+                <w:rFonts w:ascii="Cambria" w:hAnsi="Cambria"/>
+                <w:b/>
+                <w:color w:val="9E1119"/>
+                <w:sz w:val="20"/>
+              </w:rPr>
+              <w:t>Colour</w:t>
+            </w:r>
+          </w:p>
+        </w:tc>
+        <w:tc>
+          <w:tcPr>
+            <w:tcW w:type="dxa" w:w="3600"/>
+            <w:shd w:val="clear" w:color="auto" w:fill="F7F1F1"/>
+          </w:tcPr>
+          <w:p>
+            <w:pPr>
+              <w:spacing w:after="40"/>
+            </w:pPr>
+            <w:r>
+              <w:rPr>
+                <w:rFonts w:ascii="Cambria" w:hAnsi="Cambria"/>
+                <w:b/>
+                <w:color w:val="9E1119"/>
+                <w:sz w:val="20"/>
+              </w:rPr>
+              <w:t>Contrast of text on it</w:t>
+            </w:r>
+          </w:p>
+        </w:tc>
+      </w:tr>
+      <w:tr>
+        <w:tc>
+          <w:tcPr>
+            <w:tcW w:type="dxa" w:w="3744"/>
+          </w:tcPr>
+          <w:p>
+            <w:pPr>
+              <w:spacing w:after="40"/>
+            </w:pPr>
+            <w:r>
+              <w:rPr>
+                <w:rFonts w:ascii="Cambria" w:hAnsi="Cambria"/>
+                <w:b w:val="0"/>
+                <w:color w:val="191113"/>
+                <w:sz w:val="20"/>
+              </w:rPr>
+              <w:t>CA57 – Programación Web</w:t>
+            </w:r>
+          </w:p>
+        </w:tc>
+        <w:tc>
+          <w:tcPr>
+            <w:tcW w:type="dxa" w:w="2016"/>
+          </w:tcPr>
+          <w:p>
+            <w:pPr>
+              <w:spacing w:after="40"/>
+            </w:pPr>
+            <w:r>
+              <w:rPr>
+                <w:rFonts w:ascii="Cambria" w:hAnsi="Cambria"/>
+                <w:b w:val="0"/>
+                <w:color w:val="191113"/>
+                <w:sz w:val="20"/>
+              </w:rPr>
+              <w:t>Pastel blue</w:t>
+            </w:r>
+          </w:p>
+        </w:tc>
+        <w:tc>
+          <w:tcPr>
+            <w:tcW w:type="dxa" w:w="3600"/>
+          </w:tcPr>
+          <w:p>
+            <w:pPr>
+              <w:spacing w:after="40"/>
+            </w:pPr>
+            <w:r>
+              <w:rPr>
+                <w:rFonts w:ascii="Cambria" w:hAnsi="Cambria"/>
+                <w:b w:val="0"/>
+                <w:color w:val="191113"/>
+                <w:sz w:val="20"/>
+              </w:rPr>
+              <w:t>14.78:1 light / 12.30:1 dark</w:t>
+            </w:r>
+          </w:p>
+        </w:tc>
+      </w:tr>
+      <w:tr>
+        <w:tc>
+          <w:tcPr>
+            <w:tcW w:type="dxa" w:w="3744"/>
+          </w:tcPr>
+          <w:p>
+            <w:pPr>
+              <w:spacing w:after="40"/>
+            </w:pPr>
+            <w:r>
+              <w:rPr>
+                <w:rFonts w:ascii="Cambria" w:hAnsi="Cambria"/>
+                <w:b w:val="0"/>
+                <w:color w:val="191113"/>
+                <w:sz w:val="20"/>
+              </w:rPr>
+              <w:t>CA56-TA24 – Procesos Estocásticos</w:t>
+            </w:r>
+          </w:p>
+        </w:tc>
+        <w:tc>
+          <w:tcPr>
+            <w:tcW w:type="dxa" w:w="2016"/>
+          </w:tcPr>
+          <w:p>
+            <w:pPr>
+              <w:spacing w:after="40"/>
+            </w:pPr>
+            <w:r>
+              <w:rPr>
+                <w:rFonts w:ascii="Cambria" w:hAnsi="Cambria"/>
+                <w:b w:val="0"/>
+                <w:color w:val="191113"/>
+                <w:sz w:val="20"/>
+              </w:rPr>
+              <w:t>Pastel red</w:t>
+            </w:r>
+          </w:p>
+        </w:tc>
+        <w:tc>
+          <w:tcPr>
+            <w:tcW w:type="dxa" w:w="3600"/>
+          </w:tcPr>
+          <w:p>
+            <w:pPr>
+              <w:spacing w:after="40"/>
+            </w:pPr>
+            <w:r>
+              <w:rPr>
+                <w:rFonts w:ascii="Cambria" w:hAnsi="Cambria"/>
+                <w:b w:val="0"/>
+                <w:color w:val="191113"/>
+                <w:sz w:val="20"/>
+              </w:rPr>
+              <w:t>14.25:1 light / 12.60:1 dark</w:t>
+            </w:r>
+          </w:p>
+        </w:tc>
+      </w:tr>
+      <w:tr>
+        <w:tc>
+          <w:tcPr>
+            <w:tcW w:type="dxa" w:w="3744"/>
+          </w:tcPr>
+          <w:p>
+            <w:pPr>
+              <w:spacing w:after="40"/>
+            </w:pPr>
+            <w:r>
+              <w:rPr>
+                <w:rFonts w:ascii="Cambria" w:hAnsi="Cambria"/>
+                <w:b w:val="0"/>
+                <w:color w:val="191113"/>
+                <w:sz w:val="20"/>
+              </w:rPr>
+              <w:t>TM11 – Física II</w:t>
+            </w:r>
+          </w:p>
+        </w:tc>
+        <w:tc>
+          <w:tcPr>
+            <w:tcW w:type="dxa" w:w="2016"/>
+          </w:tcPr>
+          <w:p>
+            <w:pPr>
+              <w:spacing w:after="40"/>
+            </w:pPr>
+            <w:r>
+              <w:rPr>
+                <w:rFonts w:ascii="Cambria" w:hAnsi="Cambria"/>
+                <w:b w:val="0"/>
+                <w:color w:val="191113"/>
+                <w:sz w:val="20"/>
+              </w:rPr>
+              <w:t>Pastel yellow</w:t>
+            </w:r>
+          </w:p>
+        </w:tc>
+        <w:tc>
+          <w:tcPr>
+            <w:tcW w:type="dxa" w:w="3600"/>
+          </w:tcPr>
+          <w:p>
+            <w:pPr>
+              <w:spacing w:after="40"/>
+            </w:pPr>
+            <w:r>
+              <w:rPr>
+                <w:rFonts w:ascii="Cambria" w:hAnsi="Cambria"/>
+                <w:b w:val="0"/>
+                <w:color w:val="191113"/>
+                <w:sz w:val="20"/>
+              </w:rPr>
+              <w:t>15.77:1 light / 11.02:1 dark</w:t>
+            </w:r>
+          </w:p>
+        </w:tc>
+      </w:tr>
+    </w:tbl>
+    <w:p>
+      <w:pPr>
+        <w:spacing w:after="80"/>
+      </w:pPr>
+    </w:p>
+    <w:p>
+      <w:pPr>
+        <w:spacing w:after="160"/>
+      </w:pPr>
+      <w:r>
+        <w:rPr>
+          <w:rFonts w:ascii="Cambria" w:hAnsi="Cambria"/>
+          <w:b/>
+          <w:i w:val="0"/>
+          <w:color w:val="191113"/>
+          <w:sz w:val="22"/>
+        </w:rPr>
+        <w:t xml:space="preserve">Colour is a reinforcement, never the only cue. </w:t>
+      </w:r>
+      <w:r>
+        <w:rPr>
+          <w:rFonts w:ascii="Cambria" w:hAnsi="Cambria"/>
+          <w:b w:val="0"/>
+          <w:i w:val="0"/>
+          <w:color w:val="191113"/>
+          <w:sz w:val="22"/>
+        </w:rPr>
+        <w:t>Every cell still carries the course code written inside it, so someone who cannot distinguish the pastels loses nothing. The dark theme uses muted versions: a light pastel on a dark ground glares and the text on top stops being readable.</w:t>
+      </w:r>
+    </w:p>
+    <w:p>
+      <w:pPr>
+        <w:keepNext/>
         <w:spacing w:before="400" w:after="140"/>
       </w:pPr>
       <w:r>
@@ -1773,6 +2259,126 @@
           </w:p>
         </w:tc>
       </w:tr>
+      <w:tr>
+        <w:tc>
+          <w:tcPr>
+            <w:tcW w:type="dxa" w:w="3888"/>
+          </w:tcPr>
+          <w:p>
+            <w:pPr>
+              <w:spacing w:after="40"/>
+            </w:pPr>
+            <w:r>
+              <w:rPr>
+                <w:rFonts w:ascii="Cambria" w:hAnsi="Cambria"/>
+                <w:b w:val="0"/>
+                <w:color w:val="191113"/>
+                <w:sz w:val="20"/>
+              </w:rPr>
+              <w:t>Skip link, aria-current, main id</w:t>
+            </w:r>
+          </w:p>
+        </w:tc>
+        <w:tc>
+          <w:tcPr>
+            <w:tcW w:type="dxa" w:w="5472"/>
+          </w:tcPr>
+          <w:p>
+            <w:pPr>
+              <w:spacing w:after="40"/>
+            </w:pPr>
+            <w:r>
+              <w:rPr>
+                <w:rFonts w:ascii="Cambria" w:hAnsi="Cambria"/>
+                <w:b/>
+                <w:color w:val="2C6248"/>
+                <w:sz w:val="20"/>
+              </w:rPr>
+              <w:t>Present on all six pages</w:t>
+            </w:r>
+          </w:p>
+        </w:tc>
+      </w:tr>
+      <w:tr>
+        <w:tc>
+          <w:tcPr>
+            <w:tcW w:type="dxa" w:w="3888"/>
+          </w:tcPr>
+          <w:p>
+            <w:pPr>
+              <w:spacing w:after="40"/>
+            </w:pPr>
+            <w:r>
+              <w:rPr>
+                <w:rFonts w:ascii="Cambria" w:hAnsi="Cambria"/>
+                <w:b w:val="0"/>
+                <w:color w:val="191113"/>
+                <w:sz w:val="20"/>
+              </w:rPr>
+              <w:t>Subject colour contrast</w:t>
+            </w:r>
+          </w:p>
+        </w:tc>
+        <w:tc>
+          <w:tcPr>
+            <w:tcW w:type="dxa" w:w="5472"/>
+          </w:tcPr>
+          <w:p>
+            <w:pPr>
+              <w:spacing w:after="40"/>
+            </w:pPr>
+            <w:r>
+              <w:rPr>
+                <w:rFonts w:ascii="Cambria" w:hAnsi="Cambria"/>
+                <w:b/>
+                <w:color w:val="2C6248"/>
+                <w:sz w:val="20"/>
+              </w:rPr>
+              <w:t>11.02:1 worst case, both themes</w:t>
+            </w:r>
+          </w:p>
+        </w:tc>
+      </w:tr>
+      <w:tr>
+        <w:tc>
+          <w:tcPr>
+            <w:tcW w:type="dxa" w:w="3888"/>
+          </w:tcPr>
+          <w:p>
+            <w:pPr>
+              <w:spacing w:after="40"/>
+            </w:pPr>
+            <w:r>
+              <w:rPr>
+                <w:rFonts w:ascii="Cambria" w:hAnsi="Cambria"/>
+                <w:b w:val="0"/>
+                <w:color w:val="191113"/>
+                <w:sz w:val="20"/>
+              </w:rPr>
+              <w:t>Layout at 390 px</w:t>
+            </w:r>
+          </w:p>
+        </w:tc>
+        <w:tc>
+          <w:tcPr>
+            <w:tcW w:type="dxa" w:w="5472"/>
+          </w:tcPr>
+          <w:p>
+            <w:pPr>
+              <w:spacing w:after="40"/>
+            </w:pPr>
+            <w:r>
+              <w:rPr>
+                <w:rFonts w:ascii="Cambria" w:hAnsi="Cambria"/>
+                <w:b/>
+                <w:color w:val="2C6248"/>
+                <w:sz w:val="20"/>
+              </w:rPr>
+              <w:t>No horizontal overflow; menu wraps</w:t>
+            </w:r>
+          </w:p>
+        </w:tc>
+      </w:tr>
     </w:tbl>
     <w:p>
       <w:pPr>

</xml_diff>